<commit_message>
English packet: Kris's Oct 13 version with typos fixed and QR codes
Replaces the Oct 5 English packet with Kris's Oct 13 revision (the one
the Spanish packet was translated from), so both languages match.
Fixed: Projests, Ask you teacher (x2), 2rd/3nd grade, the the, baord,
who have, report(optional), step by step guide, don't's, groups up to,
and the two contact sentences that ended in "have questions".
Registration QR code and link at the three ***** spots, plus the link
after "Complete the online form" in both languages. 10 pages each; all
QR codes scan.

Co-Authored-By: Claude Opus 5.5 (1M context) <noreply@anthropic.com>
Claude-Session: https://claude.ai/code/session_01GwHvVSetx4xQUxzu4PM8gK
</commit_message>
<xml_diff>
--- a/packet/Capri-Science-Fair-Packet-2026-27-EN.docx
+++ b/packet/Capri-Science-Fair-Packet-2026-27-EN.docx
@@ -485,10 +485,9 @@
               <w:r>
                 <w:rPr>
                   <w:rFonts w:ascii="Lato" w:eastAsia="Lato" w:hAnsi="Lato" w:cs="Lato"/>
+                  <w:bCs/>
                   <w:color w:val="E8611A"/>
                   <w:u w:val="single"/>
-                  <w:sz w:val="22"/>
-                  <w:szCs w:val="22"/>
                 </w:rPr>
                 <w:t xml:space="preserve"> https://localhostusr.github.io/capri-science-fair-2026-27/</w:t>
               </w:r>
@@ -685,7 +684,7 @@
                 <w:rFonts w:ascii="Lato" w:eastAsia="Lato" w:hAnsi="Lato" w:cs="Lato"/>
                 <w:color w:val="000000"/>
               </w:rPr>
-              <w:t xml:space="preserve">pm – Take Projests Home</w:t>
+              <w:t xml:space="preserve">pm – Take Projects Home</w:t>
             </w:r>
           </w:p>
         </w:tc>
@@ -770,7 +769,7 @@
         <w:rPr>
           <w:rFonts w:ascii="Lato" w:eastAsia="Lato" w:hAnsi="Lato" w:cs="Lato"/>
         </w:rPr>
-        <w:t xml:space="preserve">In School:  Ms. Holmes in the STEM room.</w:t>
+        <w:t xml:space="preserve">In School: STEM teacher Ms. Holmes, Aliza.Holmes@eusd.net</w:t>
       </w:r>
     </w:p>
     <w:p>
@@ -878,7 +877,7 @@
         <w:rPr>
           <w:rFonts w:ascii="Lato" w:hAnsi="Lato"/>
         </w:rPr>
-        <w:t xml:space="preserve">What type of science fair project do you want to do?  There are 5 main types.  The traditional model, the design/engineer model, the product comparison model, the demonstration model, and the scientific/infographic model.  Ask you teacher for the differences between these to help find your style.</w:t>
+        <w:t xml:space="preserve">What type of science fair project do you want to do?  There are 5 main types.  The traditional model, the design/engineer model, the product comparison model, the demonstration model, and the scientific/infographic model.  Ask your teacher for the differences between these to help find your style.</w:t>
       </w:r>
     </w:p>
     <w:p>
@@ -939,7 +938,7 @@
         <w:rPr>
           <w:rFonts w:ascii="Lato" w:hAnsi="Lato"/>
         </w:rPr>
-        <w:t xml:space="preserve"> You can work alone or in groups up to 3 students.</w:t>
+        <w:t xml:space="preserve"> You can work alone or in groups of up to 3 students.</w:t>
       </w:r>
     </w:p>
     <w:p>
@@ -1179,20 +1178,32 @@
           <w:sz w:val="28"/>
           <w:szCs w:val="28"/>
         </w:rPr>
-        <w:t xml:space="preserve">Use this QR code or this link to register:</w:t>
-      </w:r>
-    </w:p>
-    <w:p>
-      <w:pPr>
-        <w:spacing w:before="120" w:after="0"/>
+        <w:t xml:space="preserve">Use this QR code or this link to register: </w:t>
+      </w:r>
+      <w:hyperlink r:id="rIdRegLink1" w:history="1">
+        <w:r>
+          <w:rPr>
+            <w:rFonts w:ascii="Lato" w:eastAsia="Cambria" w:hAnsi="Lato" w:cs="Cambria"/>
+            <w:sz w:val="28"/>
+            <w:szCs w:val="28"/>
+            <w:color w:val="E8611A"/>
+            <w:u w:val="single"/>
+          </w:rPr>
+          <w:t xml:space="preserve">https://localhostusr.github.io/capri-science-fair-2026-27/</w:t>
+        </w:r>
+      </w:hyperlink>
+    </w:p>
+    <w:p>
+      <w:pPr>
+        <w:spacing w:before="40" w:after="0"/>
         <w:jc w:val="center"/>
       </w:pPr>
       <w:r>
         <w:drawing>
           <wp:inline distT="0" distB="0" distL="0" distR="0">
-            <wp:extent cx="1280160" cy="1280160"/>
+            <wp:extent cx="731520" cy="731520"/>
             <wp:effectExtent l="0" t="0" r="0" b="0"/>
-            <wp:docPr id="901" name="Registration QR code 1" descr="QR code linking to the Capri Science Fair registration page"/>
+            <wp:docPr id="901" name="Registration QR code 1" descr="QR code: Capri Science Fair sign-up / inscripción"/>
             <wp:cNvGraphicFramePr>
               <a:graphicFrameLocks xmlns:a="http://schemas.openxmlformats.org/drawingml/2006/main" noChangeAspect="1"/>
             </wp:cNvGraphicFramePr>
@@ -1212,7 +1223,7 @@
                   <pic:spPr>
                     <a:xfrm>
                       <a:off x="0" y="0"/>
-                      <a:ext cx="1280160" cy="1280160"/>
+                      <a:ext cx="731520" cy="731520"/>
                     </a:xfrm>
                     <a:prstGeom prst="rect">
                       <a:avLst/>
@@ -1224,25 +1235,6 @@
           </wp:inline>
         </w:drawing>
       </w:r>
-    </w:p>
-    <w:p>
-      <w:pPr>
-        <w:spacing w:before="60" w:after="120"/>
-        <w:jc w:val="center"/>
-      </w:pPr>
-      <w:hyperlink r:id="rIdRegLink1" w:history="1">
-        <w:r>
-          <w:rPr>
-            <w:rFonts w:ascii="Lato" w:eastAsia="Lato" w:hAnsi="Lato" w:cs="Lato"/>
-            <w:b/>
-            <w:color w:val="E8611A"/>
-            <w:u w:val="single"/>
-            <w:sz w:val="24"/>
-            <w:szCs w:val="24"/>
-          </w:rPr>
-          <w:t xml:space="preserve">https://localhostusr.github.io/capri-science-fair-2026-27/</w:t>
-        </w:r>
-      </w:hyperlink>
     </w:p>
     <w:p>
       <w:pPr>
@@ -1645,7 +1637,7 @@
               <w:rPr>
                 <w:rFonts w:ascii="Lato" w:hAnsi="Lato"/>
               </w:rPr>
-              <w:t>2rd – 6th Grade</w:t>
+              <w:t>2nd – 6th Grade</w:t>
             </w:r>
           </w:p>
         </w:tc>
@@ -2011,7 +2003,7 @@
               <w:rPr>
                 <w:rFonts w:ascii="Lato" w:hAnsi="Lato"/>
               </w:rPr>
-              <w:t>K – 3nd Grade</w:t>
+              <w:t>K – 3rd Grade</w:t>
             </w:r>
           </w:p>
         </w:tc>
@@ -2324,7 +2316,7 @@
         <w:rPr>
           <w:rFonts w:ascii="Lato" w:hAnsi="Lato"/>
         </w:rPr>
-        <w:t xml:space="preserve">Now create your project plan.  It is step by step guide to completing your project. You can follow the examples below. Your teacher should be able to give you a template to follow also.</w:t>
+        <w:t xml:space="preserve">Now create your project plan.  It is a step-by-step guide to completing your project. You can follow the examples below. Your teacher should be able to give you a template to follow also.</w:t>
       </w:r>
     </w:p>
     <w:p>
@@ -2343,7 +2335,7 @@
           <w:rFonts w:ascii="Lato" w:eastAsia="Cambria" w:hAnsi="Lato" w:cs="Cambria"/>
           <w:color w:val="231F20"/>
         </w:rPr>
-        <w:t xml:space="preserve">Your plan is a brief summary (fewer than 300 words) of the purpose of your project, your experimental/design procedure, key findings or data, and significant conclusions that can be drawn from the evidence you will collect. Your plan will be the the template for your final abstract. </w:t>
+        <w:t xml:space="preserve">Your plan is a brief summary (fewer than 300 words) of the purpose of your project, your experimental/design procedure, key findings or data, and significant conclusions that can be drawn from the evidence you will collect. Your plan will be the template for your final abstract. </w:t>
       </w:r>
     </w:p>
     <w:p>
@@ -2883,7 +2875,7 @@
         <w:rPr>
           <w:rFonts w:ascii="Lato" w:hAnsi="Lato"/>
         </w:rPr>
-        <w:t xml:space="preserve">Organize the information you require.  What are you collecting and how are you recording it.</w:t>
+        <w:t xml:space="preserve">Organize the information you require.  What are you collecting and how are you recording it?</w:t>
       </w:r>
     </w:p>
     <w:p>
@@ -3043,7 +3035,24 @@
         <w:rPr>
           <w:rFonts w:ascii="Lato" w:eastAsia="Lato" w:hAnsi="Lato" w:cs="Lato"/>
         </w:rPr>
-        <w:t xml:space="preserve"> Review your project plan and turn into an Abstract by adding in the results and conclusions.  Also update your materials/methods and help as is necessary.</w:t>
+        <w:t xml:space="preserve"> Review your project plan and update it by adding in the results and conclusions.  Also update your materials/methods and help as is necessary.   This completed plan is called an Abstract.</w:t>
+      </w:r>
+    </w:p>
+    <w:p>
+      <w:pPr>
+        <w:numPr>
+          <w:ilvl w:val="0"/>
+          <w:numId w:val="15"/>
+        </w:numPr>
+        <w:rPr>
+          <w:rFonts w:ascii="Lato" w:eastAsia="Lato" w:hAnsi="Lato" w:cs="Lato"/>
+        </w:rPr>
+      </w:pPr>
+      <w:r>
+        <w:rPr>
+          <w:rFonts w:ascii="Lato" w:eastAsia="Lato" w:hAnsi="Lato" w:cs="Lato"/>
+        </w:rPr>
+        <w:t xml:space="preserve"> Use this abstract to complete your project.</w:t>
       </w:r>
     </w:p>
     <w:p>
@@ -3053,6 +3062,38 @@
           <w:rFonts w:ascii="Lato" w:eastAsia="Lato" w:hAnsi="Lato" w:cs="Lato"/>
         </w:rPr>
       </w:pPr>
+    </w:p>
+    <w:p>
+      <w:pPr>
+        <w:ind w:left="720"/>
+        <w:rPr>
+          <w:rFonts w:ascii="Lato" w:eastAsia="Lato" w:hAnsi="Lato" w:cs="Lato"/>
+          <w:b/>
+          <w:bCs/>
+        </w:rPr>
+      </w:pPr>
+      <w:r>
+        <w:rPr>
+          <w:rFonts w:ascii="Lato" w:eastAsia="Lato" w:hAnsi="Lato" w:cs="Lato"/>
+          <w:b/>
+          <w:bCs/>
+        </w:rPr>
+        <w:t xml:space="preserve">******Extra Credit?? – Ask your teacher if you get extra credit for handing in a report******</w:t>
+      </w:r>
+    </w:p>
+    <w:p>
+      <w:pPr>
+        <w:ind w:left="720"/>
+        <w:rPr>
+          <w:rFonts w:ascii="Lato" w:eastAsia="Lato" w:hAnsi="Lato" w:cs="Lato"/>
+        </w:rPr>
+      </w:pPr>
+      <w:r>
+        <w:rPr>
+          <w:rFonts w:ascii="Lato" w:eastAsia="Lato" w:hAnsi="Lato" w:cs="Lato"/>
+        </w:rPr>
+        <w:t xml:space="preserve">If you do, use this abstract to complete both the project and the written report.</w:t>
+      </w:r>
     </w:p>
     <w:p>
       <w:pPr>
@@ -3099,24 +3140,19 @@
         </w:rPr>
       </w:pPr>
       <w:r>
-        <w:rPr>
-          <w:rFonts w:ascii="Lato" w:eastAsia="Lato" w:hAnsi="Lato" w:cs="Lato"/>
-          <w:b/>
-        </w:rPr>
-        <w:t xml:space="preserve">To register please use this QR code or link:</w:t>
-      </w:r>
-    </w:p>
-    <w:p>
-      <w:pPr>
-        <w:spacing w:before="120" w:after="0"/>
-        <w:jc w:val="center"/>
-      </w:pPr>
-      <w:r>
         <w:drawing>
-          <wp:inline distT="0" distB="0" distL="0" distR="0">
-            <wp:extent cx="1280160" cy="1280160"/>
+          <wp:anchor distT="0" distB="0" distL="114300" distR="0" simplePos="0" relativeHeight="251659264" behindDoc="0" locked="0" layoutInCell="1" allowOverlap="1">
+            <wp:simplePos x="0" y="0"/>
+            <wp:positionH relativeFrom="margin">
+              <wp:align>right</wp:align>
+            </wp:positionH>
+            <wp:positionV relativeFrom="paragraph">
+              <wp:posOffset>-320040</wp:posOffset>
+            </wp:positionV>
+            <wp:extent cx="731520" cy="731520"/>
             <wp:effectExtent l="0" t="0" r="0" b="0"/>
-            <wp:docPr id="902" name="Registration QR code 2" descr="QR code linking to the Capri Science Fair registration page"/>
+            <wp:wrapSquare wrapText="bothSides"/>
+            <wp:docPr id="902" name="Registration QR code 2" descr="QR code: Capri Science Fair sign-up / inscripción"/>
             <wp:cNvGraphicFramePr>
               <a:graphicFrameLocks xmlns:a="http://schemas.openxmlformats.org/drawingml/2006/main" noChangeAspect="1"/>
             </wp:cNvGraphicFramePr>
@@ -3136,7 +3172,7 @@
                   <pic:spPr>
                     <a:xfrm>
                       <a:off x="0" y="0"/>
-                      <a:ext cx="1280160" cy="1280160"/>
+                      <a:ext cx="731520" cy="731520"/>
                     </a:xfrm>
                     <a:prstGeom prst="rect">
                       <a:avLst/>
@@ -3145,15 +3181,16 @@
                 </pic:pic>
               </a:graphicData>
             </a:graphic>
-          </wp:inline>
+          </wp:anchor>
         </w:drawing>
       </w:r>
-    </w:p>
-    <w:p>
-      <w:pPr>
-        <w:spacing w:before="60" w:after="120"/>
-        <w:jc w:val="center"/>
-      </w:pPr>
+      <w:r>
+        <w:rPr>
+          <w:rFonts w:ascii="Lato" w:eastAsia="Lato" w:hAnsi="Lato" w:cs="Lato"/>
+          <w:b/>
+        </w:rPr>
+        <w:t xml:space="preserve">To register please use this QR code or link: </w:t>
+      </w:r>
       <w:hyperlink r:id="rIdRegLink1" w:history="1">
         <w:r>
           <w:rPr>
@@ -3161,42 +3198,10 @@
             <w:b/>
             <w:color w:val="E8611A"/>
             <w:u w:val="single"/>
-            <w:sz w:val="24"/>
-            <w:szCs w:val="24"/>
           </w:rPr>
           <w:t xml:space="preserve">https://localhostusr.github.io/capri-science-fair-2026-27/</w:t>
         </w:r>
       </w:hyperlink>
-    </w:p>
-    <w:p>
-      <w:pPr>
-        <w:jc w:val="center"/>
-        <w:rPr>
-          <w:rFonts w:ascii="Lato" w:eastAsia="Lato" w:hAnsi="Lato" w:cs="Lato"/>
-          <w:b/>
-        </w:rPr>
-      </w:pPr>
-    </w:p>
-    <w:p>
-      <w:pPr>
-        <w:rPr>
-          <w:rFonts w:ascii="Lato" w:eastAsia="Lato" w:hAnsi="Lato" w:cs="Lato"/>
-          <w:b/>
-          <w:sz w:val="28"/>
-          <w:szCs w:val="28"/>
-        </w:rPr>
-      </w:pPr>
-    </w:p>
-    <w:p>
-      <w:pPr>
-        <w:jc w:val="center"/>
-        <w:rPr>
-          <w:rFonts w:ascii="Lato" w:eastAsia="Lato" w:hAnsi="Lato" w:cs="Lato"/>
-          <w:b/>
-          <w:sz w:val="28"/>
-          <w:szCs w:val="28"/>
-        </w:rPr>
-      </w:pPr>
     </w:p>
     <w:p>
       <w:pPr>
@@ -3698,7 +3703,7 @@
           <w:b/>
           <w:bCs/>
         </w:rPr>
-        <w:t xml:space="preserve">Part 4:  Organize your information and results and make your science fair baord</w:t>
+        <w:t xml:space="preserve">Part 4:  Organize your information and results and make your science fair board</w:t>
       </w:r>
     </w:p>
     <w:p>
@@ -3727,7 +3732,7 @@
         <w:rPr>
           <w:rFonts w:ascii="Lato" w:hAnsi="Lato"/>
         </w:rPr>
-        <w:t xml:space="preserve">Prepare the sections for your science fair project board and report.  These boards are provided free by the PTA.  Supplies are limited so request one early.</w:t>
+        <w:t xml:space="preserve">Prepare the sections for your science fair project board and report (optional).  These boards are provided free by the PTA.  Supplies are limited so request one early.</w:t>
       </w:r>
     </w:p>
     <w:p>
@@ -3917,7 +3922,7 @@
         <w:rPr>
           <w:rFonts w:ascii="Lato" w:hAnsi="Lato"/>
         </w:rPr>
-        <w:t xml:space="preserve">Make sure these sections are clear and easy to read.  This is how everyone else will learn about what you have done.  This is your science project story.  Does it make sense to someone who have no experience?</w:t>
+        <w:t xml:space="preserve">Make sure these sections are clear and easy to read.  This is how everyone else will learn about what you have done.  This is your science project story.  Does it make sense to someone who has no experience?</w:t>
       </w:r>
     </w:p>
     <w:p>
@@ -3936,7 +3941,7 @@
         <w:rPr>
           <w:rFonts w:ascii="Lato" w:eastAsia="Lato" w:hAnsi="Lato" w:cs="Lato"/>
         </w:rPr>
-        <w:t xml:space="preserve">The report and the display have shared goals.  They both tell clearly:</w:t>
+        <w:t xml:space="preserve">The report (if you are doing one) and the display have shared goals.  They both tell clearly:</w:t>
       </w:r>
     </w:p>
     <w:p>
@@ -4149,7 +4154,7 @@
           <w:rFonts w:ascii="Lato" w:eastAsia="Lato" w:hAnsi="Lato" w:cs="Lato"/>
           <w:b/>
         </w:rPr>
-        <w:t xml:space="preserve">Major parts of a Science Fair Report and Display.</w:t>
+        <w:t xml:space="preserve">Major parts of a Science Fair Display and Report (Optional).</w:t>
       </w:r>
       <w:r>
         <w:rPr>
@@ -4962,7 +4967,7 @@
         <w:rPr>
           <w:rFonts w:ascii="Lato" w:eastAsia="Lato" w:hAnsi="Lato" w:cs="Lato"/>
         </w:rPr>
-        <w:t xml:space="preserve">These regulations outline basic do’s and don't’s for the Science Fair.  Please contact the Science Fair coordinator at Kris Thomson </w:t>
+        <w:t xml:space="preserve">These regulations outline basic do’s and don’ts for the Science Fair.  If you have questions, please contact Science Fair coordinator Kris Thomson at </w:t>
       </w:r>
       <w:hyperlink r:id="rId16" w:history="1">
         <w:r>
@@ -4990,7 +4995,22 @@
         <w:rPr>
           <w:rFonts w:ascii="Lato" w:eastAsia="Lato" w:hAnsi="Lato" w:cs="Lato"/>
         </w:rPr>
-        <w:t xml:space="preserve">if you have questions.</w:t>
+        <w:t xml:space="preserve">or STEM teacher Ms. Holmes at </w:t>
+      </w:r>
+      <w:hyperlink r:id="rId17" w:history="1">
+        <w:r>
+          <w:rPr>
+            <w:rStyle w:val="Hyperlink"/>
+            <w:rFonts w:ascii="Lato" w:eastAsia="Lato" w:hAnsi="Lato" w:cs="Lato"/>
+          </w:rPr>
+          <w:t>Aliza.Holmes@eusd.net</w:t>
+        </w:r>
+      </w:hyperlink>
+      <w:r>
+        <w:rPr>
+          <w:rFonts w:ascii="Lato" w:eastAsia="Lato" w:hAnsi="Lato" w:cs="Lato"/>
+        </w:rPr>
+        <w:t xml:space="preserve">.</w:t>
       </w:r>
     </w:p>
     <w:p>
@@ -5059,22 +5079,18 @@
     </w:p>
     <w:p>
       <w:pPr>
-        <w:numPr>
-          <w:ilvl w:val="0"/>
-          <w:numId w:val="11"/>
-        </w:numPr>
-        <w:ind w:left="1440" w:hanging="360"/>
-        <w:rPr>
-          <w:rFonts w:ascii="Lato" w:eastAsia="Lato" w:hAnsi="Lato" w:cs="Lato"/>
-        </w:rPr>
-      </w:pPr>
-      <w:r>
-        <w:rPr>
-          <w:rFonts w:ascii="Lato" w:eastAsia="Lato" w:hAnsi="Lato" w:cs="Lato"/>
-        </w:rPr>
-        <w:t xml:space="preserve">Scientific Review Committee approval is REQUIRED for any projects that involve any of the following.  Contact Kris Thomson </w:t>
-      </w:r>
-      <w:hyperlink r:id="rId17" w:history="1">
+        <w:ind w:left="1440"/>
+        <w:rPr>
+          <w:rFonts w:ascii="Lato" w:eastAsia="Lato" w:hAnsi="Lato" w:cs="Lato"/>
+        </w:rPr>
+      </w:pPr>
+      <w:r>
+        <w:rPr>
+          <w:rFonts w:ascii="Lato" w:eastAsia="Lato" w:hAnsi="Lato" w:cs="Lato"/>
+        </w:rPr>
+        <w:t xml:space="preserve">Scientific Review Committee approval is REQUIRED for any projects that involve any of the following.  Contact Kris Thomson at </w:t>
+      </w:r>
+      <w:hyperlink r:id="rId18" w:history="1">
         <w:r>
           <w:rPr>
             <w:rStyle w:val="Hyperlink"/>
@@ -5100,6 +5116,24 @@
         <w:rPr>
           <w:rFonts w:ascii="Lato" w:eastAsia="Lato" w:hAnsi="Lato" w:cs="Lato"/>
         </w:rPr>
+        <w:t xml:space="preserve">or STEM teacher Ms. Holmes at </w:t>
+      </w:r>
+      <w:hyperlink r:id="rId19" w:history="1">
+        <w:r>
+          <w:rPr>
+            <w:rStyle w:val="Hyperlink"/>
+            <w:rFonts w:ascii="Lato" w:eastAsia="Lato" w:hAnsi="Lato" w:cs="Lato"/>
+          </w:rPr>
+          <w:t>Aliza.Holmes@eusd.net</w:t>
+        </w:r>
+      </w:hyperlink>
+      <w:r>
+        <w:t xml:space="preserve"> </w:t>
+      </w:r>
+      <w:r>
+        <w:rPr>
+          <w:rFonts w:ascii="Lato" w:eastAsia="Lato" w:hAnsi="Lato" w:cs="Lato"/>
+        </w:rPr>
         <w:t xml:space="preserve">immediately to obtain the Certificate of Compliance BEFORE doing the project.</w:t>
       </w:r>
     </w:p>
@@ -5190,6 +5224,7 @@
         <w:rPr>
           <w:rFonts w:ascii="Lato" w:eastAsia="Lato" w:hAnsi="Lato" w:cs="Lato"/>
         </w:rPr>
+        <w:lastRenderedPageBreak/>
         <w:t xml:space="preserve">rDNA – recombinant DNA</w:t>
       </w:r>
     </w:p>
@@ -5226,7 +5261,6 @@
         <w:rPr>
           <w:rFonts w:ascii="Lato" w:eastAsia="Lato" w:hAnsi="Lato" w:cs="Lato"/>
         </w:rPr>
-        <w:lastRenderedPageBreak/>
         <w:t xml:space="preserve">Chemicals (including household cleaning agents, solvents, metals, organic chemicals)</w:t>
       </w:r>
     </w:p>
@@ -5446,20 +5480,31 @@
           <w:rFonts w:ascii="Lato" w:eastAsia="Lato" w:hAnsi="Lato" w:cs="Lato"/>
           <w:b/>
         </w:rPr>
-        <w:t xml:space="preserve">To register please use this QR code or link:</w:t>
-      </w:r>
-    </w:p>
-    <w:p>
-      <w:pPr>
-        <w:spacing w:before="120" w:after="0"/>
+        <w:t xml:space="preserve">To register please use this QR code or link: </w:t>
+      </w:r>
+      <w:hyperlink r:id="rIdRegLink1" w:history="1">
+        <w:r>
+          <w:rPr>
+            <w:rFonts w:ascii="Lato" w:eastAsia="Lato" w:hAnsi="Lato" w:cs="Lato"/>
+            <w:b/>
+            <w:color w:val="E8611A"/>
+            <w:u w:val="single"/>
+          </w:rPr>
+          <w:t xml:space="preserve">https://localhostusr.github.io/capri-science-fair-2026-27/</w:t>
+        </w:r>
+      </w:hyperlink>
+    </w:p>
+    <w:p>
+      <w:pPr>
+        <w:spacing w:before="40" w:after="0"/>
         <w:jc w:val="center"/>
       </w:pPr>
       <w:r>
         <w:drawing>
           <wp:inline distT="0" distB="0" distL="0" distR="0">
-            <wp:extent cx="1280160" cy="1280160"/>
+            <wp:extent cx="731520" cy="731520"/>
             <wp:effectExtent l="0" t="0" r="0" b="0"/>
-            <wp:docPr id="903" name="Registration QR code 3" descr="QR code linking to the Capri Science Fair registration page"/>
+            <wp:docPr id="903" name="Registration QR code 3" descr="QR code: Capri Science Fair sign-up / inscripción"/>
             <wp:cNvGraphicFramePr>
               <a:graphicFrameLocks xmlns:a="http://schemas.openxmlformats.org/drawingml/2006/main" noChangeAspect="1"/>
             </wp:cNvGraphicFramePr>
@@ -5479,7 +5524,7 @@
                   <pic:spPr>
                     <a:xfrm>
                       <a:off x="0" y="0"/>
-                      <a:ext cx="1280160" cy="1280160"/>
+                      <a:ext cx="731520" cy="731520"/>
                     </a:xfrm>
                     <a:prstGeom prst="rect">
                       <a:avLst/>
@@ -5494,26 +5539,7 @@
     </w:p>
     <w:p>
       <w:pPr>
-        <w:spacing w:before="60" w:after="120"/>
         <w:jc w:val="center"/>
-      </w:pPr>
-      <w:hyperlink r:id="rIdRegLink1" w:history="1">
-        <w:r>
-          <w:rPr>
-            <w:rFonts w:ascii="Lato" w:eastAsia="Lato" w:hAnsi="Lato" w:cs="Lato"/>
-            <w:b/>
-            <w:color w:val="E8611A"/>
-            <w:u w:val="single"/>
-            <w:sz w:val="24"/>
-            <w:szCs w:val="24"/>
-          </w:rPr>
-          <w:t xml:space="preserve">https://localhostusr.github.io/capri-science-fair-2026-27/</w:t>
-        </w:r>
-      </w:hyperlink>
-    </w:p>
-    <w:p>
-      <w:pPr>
-        <w:jc w:val="center"/>
         <w:rPr>
           <w:rFonts w:ascii="Lato" w:eastAsia="Lato" w:hAnsi="Lato" w:cs="Lato"/>
           <w:b/>
@@ -5521,12 +5547,12 @@
       </w:pPr>
     </w:p>
     <w:sectPr>
-      <w:headerReference w:type="even" r:id="rId18"/>
-      <w:headerReference w:type="default" r:id="rId19"/>
-      <w:footerReference w:type="even" r:id="rId20"/>
-      <w:footerReference w:type="default" r:id="rId21"/>
-      <w:headerReference w:type="first" r:id="rId22"/>
-      <w:footerReference w:type="first" r:id="rId23"/>
+      <w:headerReference w:type="even" r:id="rId20"/>
+      <w:headerReference w:type="default" r:id="rId21"/>
+      <w:footerReference w:type="even" r:id="rId22"/>
+      <w:footerReference w:type="default" r:id="rId23"/>
+      <w:headerReference w:type="first" r:id="rId24"/>
+      <w:footerReference w:type="first" r:id="rId25"/>
       <w:type w:val="continuous"/>
       <w:pgSz w:w="12240" w:h="15840"/>
       <w:pgMar w:top="720" w:right="720" w:bottom="720" w:left="720" w:header="720" w:footer="720" w:gutter="0"/>

</xml_diff>